<commit_message>
implemented first round of comments
</commit_message>
<xml_diff>
--- a/example_articles/countries/Afghanistan/1.countries_Afghanistan_New_York_Times.docx
+++ b/example_articles/countries/Afghanistan/1.countries_Afghanistan_New_York_Times.docx
@@ -27,17 +27,17 @@
     </w:p>
     <w:p>
       <w:r>
-        <w:t>Source File: NYT/45.DOCX</w:t>
+        <w:t>Source file: NYT/45.DOCX</w:t>
       </w:r>
     </w:p>
     <w:p>
       <w:r>
-        <w:t>Raw locations result: ['Afghanistan']</w:t>
+        <w:t>Raw locations result, 'locations': ['Afghanistan']</w:t>
       </w:r>
     </w:p>
     <w:p>
       <w:r>
-        <w:t>countries_stand_flat (Standardized): Afghanistan</w:t>
+        <w:t>Standardized locations result, 'countries_stand_flat': Afghanistan</w:t>
       </w:r>
     </w:p>
     <w:p>

</xml_diff>